<commit_message>
docs(legal): une seule adresse de contact — contact@breakeatapp.com
Les documents de l'app donnaient `reminotta@`, le site affiche `contact@`
dans son texte mais pointe son lien vers `reminotta@`, et son article 7 dit
encore autre chose. Celui qui clique n'ecrit pas a l'adresse qu'il a lue.

`contact@` est confirmee comme relevee. Les quatre documents s'alignent
dessus (12 occurrences), et les .docx/.md sont regeneres.

Co-Authored-By: Claude Opus 5 <noreply@anthropic.com>
</commit_message>
<xml_diff>
--- a/GUIDE_DEVELOPPEMENT/documents-legaux/CONDITIONS_GENERALES_D_UTILISATION.docx
+++ b/GUIDE_DEVELOPPEMENT/documents-legaux/CONDITIONS_GENERALES_D_UTILISATION.docx
@@ -127,7 +127,7 @@
           <w:sz w:val="22"/>
           <w:szCs w:val="22"/>
         </w:rPr>
-        <w:t xml:space="preserve">E-mail : reminotta@breakeatapp.com — Téléphone : 06 46 69 56 75.</w:t>
+        <w:t xml:space="preserve">E-mail : contact@breakeatapp.com — Téléphone : 06 46 69 56 75.</w:t>
       </w:r>
     </w:p>
     <w:p>
@@ -563,7 +563,7 @@
           <w:sz w:val="22"/>
           <w:szCs w:val="22"/>
         </w:rPr>
-        <w:t xml:space="preserve">En cas de retard, de non-retrait, de fermeture du point de vente ou de difficulté de remise, l’utilisateur peut écrire à reminotta@breakeatapp.com. Les conséquences commerciales sont régies par les conditions générales de vente et par la loi.</w:t>
+        <w:t xml:space="preserve">En cas de retard, de non-retrait, de fermeture du point de vente ou de difficulté de remise, l’utilisateur peut écrire à contact@breakeatapp.com. Les conséquences commerciales sont régies par les conditions générales de vente et par la loi.</w:t>
       </w:r>
     </w:p>
     <w:p>
@@ -665,7 +665,7 @@
           <w:sz w:val="22"/>
           <w:szCs w:val="22"/>
         </w:rPr>
-        <w:t xml:space="preserve">Les réclamations relatives au compte, à l’application ou à une commande peuvent être adressées à reminotta@breakeatapp.com.</w:t>
+        <w:t xml:space="preserve">Les réclamations relatives au compte, à l’application ou à une commande peuvent être adressées à contact@breakeatapp.com.</w:t>
       </w:r>
     </w:p>
     <w:p>
@@ -1117,7 +1117,7 @@
           <w:sz w:val="22"/>
           <w:szCs w:val="22"/>
         </w:rPr>
-        <w:t xml:space="preserve">L’utilisateur peut adresser une réclamation à reminotta@breakeatapp.com afin que Break Eat examine la difficulté et, si nécessaire, coordonne avec la buvette.</w:t>
+        <w:t xml:space="preserve">L’utilisateur peut adresser une réclamation à contact@breakeatapp.com afin que Break Eat examine la difficulté et, si nécessaire, coordonne avec la buvette.</w:t>
       </w:r>
     </w:p>
     <w:p>

</xml_diff>